<commit_message>
court(iowactapp): amicus brief latex gated, signature kept with the conclusion; answering brief regenerated (fb-595.54.75)
Co-Authored-By: Claude Opus 5.5 <noreply@anthropic.com>
</commit_message>
<xml_diff>
--- a/courts/eighth-circuit/iowa/state/court-of-appeals/amicus-brief/usage/OUTPUT-amicus-brief.docx
+++ b/courts/eighth-circuit/iowa/state/court-of-appeals/amicus-brief/usage/OUTPUT-amicus-brief.docx
@@ -980,7 +980,7 @@
         <w:tab/>
       </w:r>
       <w:r>
-        <w:t xml:space="preserve">10</w:t>
+        <w:t xml:space="preserve">11</w:t>
       </w:r>
     </w:p>
     <w:p>
@@ -3269,7 +3269,7 @@
           <w:tab w:val="right" w:leader="dot" w:pos="9360"/>
         </w:tabs>
         <w:spacing w:before="196" w:after="0" w:line="322" w:lineRule="exact"/>
-        <w:ind w:left="720" w:right="1400" w:hanging="720"/>
+        <w:ind w:left="720" w:right="1820" w:hanging="720"/>
       </w:pPr>
       <w:r>
         <w:t xml:space="preserve">Iowa</w:t>
@@ -3299,7 +3299,7 @@
         <w:tab/>
       </w:r>
       <w:r>
-        <w:t xml:space="preserve">5, 6, 7, 9, 10</w:t>
+        <w:t xml:space="preserve">5, 6, 7, 9, 10, 11</w:t>
       </w:r>
     </w:p>
     <w:p>
@@ -4269,7 +4269,7 @@
     </w:p>
     <w:p>
       <w:pPr>
-        <w:pStyle w:val="BodyText"/>
+        <w:pStyle w:val="BodyTextKeep"/>
       </w:pPr>
       <w:r>
         <w:t xml:space="preserve">This brief is filed pursuant to Iowa Code § 625A.19 as it involves a challenge to the constitutionality of a law. Amici do not request time if oral arguments are scheduled. For the reasons stated herein, Amici urge the Court to find that Iowa Code § 481A.38</w:t>
@@ -4283,6 +4283,8 @@
     </w:p>
     <w:p>
       <w:pPr>
+        <w:keepNext/>
+        <w:keepLines/>
         <w:spacing w:before="0" w:after="0" w:line="576" w:lineRule="exact"/>
       </w:pPr>
     </w:p>
@@ -4579,7 +4581,7 @@
         <w:pStyle w:val="XdTail"/>
       </w:pPr>
       <w:r>
-        <w:t xml:space="preserve">[ ] this brief has been prepared in a monospaced typeface using Times New Roman in 14-point font and contains XXX lines of text, excluding the parts of the brief exempted by Iowa R. App. P. 6.903(1)⁠(g)⁠(2).</w:t>
+        <w:t xml:space="preserve">[ ] this brief has been prepared in a monospaced typeface using Times New Roman in 14-point font and contains XXX lines of text, excluding the parts of the brief exempted by Iowa R. App. P. 6.903(1)⁠(g)⁠(2).</w:t>
       </w:r>
     </w:p>
     <w:p>
@@ -5494,6 +5496,7 @@
     <w:unhideWhenUsed/>
     <w:qFormat/>
     <w:pPr>
+      <w:keepLines/>
       <w:spacing w:before="0" w:after="140" w:line="322" w:lineRule="exact"/>
     </w:pPr>
     <w:rPr>
@@ -5692,6 +5695,15 @@
       <w:ind w:firstLine="720"/>
     </w:pPr>
   </w:style>
+  <w:style w:type="paragraph" w:customStyle="1" w:styleId="BodyTextKeep">
+    <w:name w:val="Body Text Keep"/>
+    <w:basedOn w:val="BodyText"/>
+    <w:qFormat/>
+    <w:pPr>
+      <w:keepNext/>
+      <w:keepLines/>
+    </w:pPr>
+  </w:style>
   <w:style w:type="paragraph" w:customStyle="1" w:styleId="XdList1">
     <w:name w:val="XdList 1"/>
     <w:basedOn w:val="Normal"/>
@@ -5744,6 +5756,33 @@
     <w:pPr>
       <w:spacing w:before="0" w:after="0" w:line="644" w:lineRule="exact"/>
       <w:ind w:left="2160" w:hanging="720"/>
+    </w:pPr>
+  </w:style>
+  <w:style w:type="paragraph" w:customStyle="1" w:styleId="XdQuoteList1">
+    <w:name w:val="Xd Quote List 1"/>
+    <w:basedOn w:val="Normal"/>
+    <w:qFormat/>
+    <w:pPr>
+      <w:spacing w:before="0" w:after="0" w:line="322" w:lineRule="exact"/>
+      <w:ind w:left="1440" w:right="720" w:hanging="720"/>
+    </w:pPr>
+  </w:style>
+  <w:style w:type="paragraph" w:customStyle="1" w:styleId="XdQuoteList2">
+    <w:name w:val="Xd Quote List 2"/>
+    <w:basedOn w:val="Normal"/>
+    <w:qFormat/>
+    <w:pPr>
+      <w:spacing w:before="0" w:after="0" w:line="322" w:lineRule="exact"/>
+      <w:ind w:left="2160" w:right="720" w:hanging="720"/>
+    </w:pPr>
+  </w:style>
+  <w:style w:type="paragraph" w:customStyle="1" w:styleId="XdQuoteList3">
+    <w:name w:val="Xd Quote List 3"/>
+    <w:basedOn w:val="Normal"/>
+    <w:qFormat/>
+    <w:pPr>
+      <w:spacing w:before="0" w:after="0" w:line="322" w:lineRule="exact"/>
+      <w:ind w:left="2880" w:right="720" w:hanging="720"/>
     </w:pPr>
   </w:style>
   <w:style w:type="paragraph" w:customStyle="1" w:styleId="XdTail">

</xml_diff>

<commit_message>
chore(eval): re-render on the merged model the folders that changed on master since serial lane 2 branched, part 00 (fb-595.54.82)
</commit_message>
<xml_diff>
--- a/courts/eighth-circuit/iowa/state/court-of-appeals/amicus-brief/usage/OUTPUT-amicus-brief.docx
+++ b/courts/eighth-circuit/iowa/state/court-of-appeals/amicus-brief/usage/OUTPUT-amicus-brief.docx
@@ -980,7 +980,7 @@
         <w:tab/>
       </w:r>
       <w:r>
-        <w:t xml:space="preserve">10</w:t>
+        <w:t xml:space="preserve">11</w:t>
       </w:r>
     </w:p>
     <w:p>
@@ -3269,7 +3269,7 @@
           <w:tab w:val="right" w:leader="dot" w:pos="9360"/>
         </w:tabs>
         <w:spacing w:before="196" w:after="0" w:line="322" w:lineRule="exact"/>
-        <w:ind w:left="720" w:right="1400" w:hanging="720"/>
+        <w:ind w:left="720" w:right="1820" w:hanging="720"/>
       </w:pPr>
       <w:r>
         <w:t xml:space="preserve">Iowa</w:t>
@@ -3299,7 +3299,7 @@
         <w:tab/>
       </w:r>
       <w:r>
-        <w:t xml:space="preserve">5, 6, 7, 9, 10</w:t>
+        <w:t xml:space="preserve">5, 6, 7, 9, 10, 11</w:t>
       </w:r>
     </w:p>
     <w:p>
@@ -4269,7 +4269,7 @@
     </w:p>
     <w:p>
       <w:pPr>
-        <w:pStyle w:val="BodyText"/>
+        <w:pStyle w:val="BodyTextKeep"/>
       </w:pPr>
       <w:r>
         <w:t xml:space="preserve">This brief is filed pursuant to Iowa Code § 625A.19 as it involves a challenge to the constitutionality of a law. Amici do not request time if oral arguments are scheduled. For the reasons stated herein, Amici urge the Court to find that Iowa Code § 481A.38</w:t>
@@ -4283,6 +4283,8 @@
     </w:p>
     <w:p>
       <w:pPr>
+        <w:keepNext/>
+        <w:keepLines/>
         <w:spacing w:before="0" w:after="0" w:line="576" w:lineRule="exact"/>
       </w:pPr>
     </w:p>
@@ -5691,6 +5693,15 @@
     <w:pPr>
       <w:spacing w:before="0" w:after="0" w:line="644" w:lineRule="exact"/>
       <w:ind w:firstLine="720"/>
+    </w:pPr>
+  </w:style>
+  <w:style w:type="paragraph" w:customStyle="1" w:styleId="BodyTextKeep">
+    <w:name w:val="Body Text Keep"/>
+    <w:basedOn w:val="BodyText"/>
+    <w:qFormat/>
+    <w:pPr>
+      <w:keepNext/>
+      <w:keepLines/>
     </w:pPr>
   </w:style>
   <w:style w:type="paragraph" w:customStyle="1" w:styleId="XdList1">

</xml_diff>